<commit_message>
les lien et le footer
</commit_message>
<xml_diff>
--- a/src/assets/documents/CV_DADJA_Lamanawa_Godwin.docx
+++ b/src/assets/documents/CV_DADJA_Lamanawa_Godwin.docx
@@ -1150,75 +1150,102 @@
           </w:p>
           <w:p>
             <w:pPr>
-              <w:pStyle w:val="Normal"/>
+              <w:pStyle w:val="Heading3"/>
               <w:spacing w:before="160" w:after="40"/>
-              <w:rPr/>
-            </w:pPr>
-            <w:r>
-              <w:rPr>
-                <w:rFonts w:eastAsia="Arial" w:cs="Arial" w:ascii="Arial" w:hAnsi="Arial"/>
-                <w:b/>
-                <w:bCs/>
-                <w:color w:val="1C2833"/>
-                <w:sz w:val="21"/>
-                <w:szCs w:val="21"/>
-              </w:rPr>
-              <w:t>Gestion des rôles et droits</w:t>
-            </w:r>
-            <w:r>
-              <w:rPr>
-                <w:rFonts w:eastAsia="Arial" w:cs="Arial" w:ascii="Arial" w:hAnsi="Arial"/>
+              <w:rPr>
+                <w:rFonts w:ascii="Arial" w:hAnsi="Arial" w:eastAsia="Arial" w:cs="Arial"/>
+                <w:b w:val="false"/>
+                <w:bCs w:val="false"/>
                 <w:i/>
                 <w:iCs/>
-                <w:color w:val="5D6D7E"/>
-                <w:sz w:val="20"/>
-                <w:szCs w:val="20"/>
-              </w:rPr>
-              <w:t xml:space="preserve">  —  Projet académique PostgreSQL</w:t>
-            </w:r>
-          </w:p>
-          <w:p>
-            <w:pPr>
-              <w:pStyle w:val="ListParagraph"/>
-              <w:numPr>
-                <w:ilvl w:val="0"/>
-                <w:numId w:val="2"/>
-              </w:numPr>
-              <w:spacing w:before="30" w:after="30"/>
-              <w:rPr/>
-            </w:pPr>
-            <w:r>
-              <w:rPr>
-                <w:rFonts w:eastAsia="Arial" w:cs="Arial" w:ascii="Arial" w:hAnsi="Arial"/>
-                <w:b w:val="false"/>
-                <w:bCs w:val="false"/>
-                <w:color w:val="1C2833"/>
-                <w:sz w:val="20"/>
-                <w:szCs w:val="20"/>
-              </w:rPr>
-              <w:t>Mise en place de systèmes de permissions</w:t>
-            </w:r>
-          </w:p>
-          <w:p>
-            <w:pPr>
-              <w:pStyle w:val="ListParagraph"/>
-              <w:numPr>
-                <w:ilvl w:val="0"/>
-                <w:numId w:val="2"/>
-              </w:numPr>
-              <w:spacing w:before="30" w:after="30"/>
-              <w:rPr/>
-            </w:pPr>
-            <w:r>
-              <w:rPr>
-                <w:rFonts w:eastAsia="Arial" w:cs="Arial" w:ascii="Arial" w:hAnsi="Arial"/>
-                <w:b w:val="false"/>
-                <w:bCs w:val="false"/>
-                <w:color w:val="1C2833"/>
-                <w:sz w:val="20"/>
-                <w:szCs w:val="20"/>
-              </w:rPr>
-              <w:t>Sécurisation et structuration de bases de données</w:t>
+                <w:color w:val="1C2833"/>
+                <w:sz w:val="20"/>
+                <w:szCs w:val="20"/>
+              </w:rPr>
+            </w:pPr>
+            <w:r>
+              <w:rPr>
+                <w:rFonts w:eastAsia="Arial" w:cs="Arial" w:ascii="Arial" w:hAnsi="Arial"/>
+                <w:b w:val="false"/>
+                <w:bCs w:val="false"/>
+                <w:i/>
+                <w:iCs/>
+                <w:color w:val="1C2833"/>
+                <w:sz w:val="20"/>
+                <w:szCs w:val="20"/>
+              </w:rPr>
+              <w:t>Stagiaire en Informatique — DRAHVDR de Kara</w:t>
+            </w:r>
+          </w:p>
+          <w:p>
+            <w:pPr>
+              <w:pStyle w:val="BodyText"/>
+              <w:spacing w:before="160" w:after="40"/>
+              <w:rPr>
+                <w:rFonts w:ascii="Arial" w:hAnsi="Arial" w:eastAsia="Arial" w:cs="Arial"/>
+                <w:i/>
+                <w:iCs/>
+                <w:color w:val="1C2833"/>
+              </w:rPr>
+            </w:pPr>
+            <w:r>
+              <w:rPr>
+                <w:rStyle w:val="Strong"/>
+                <w:rFonts w:eastAsia="Arial" w:cs="Arial" w:ascii="Arial" w:hAnsi="Arial"/>
+                <w:i/>
+                <w:iCs/>
+                <w:color w:val="1C2833"/>
+              </w:rPr>
+              <w:t>Kara, Togo | Stage d’immersion professionnelle — 2 semaines</w:t>
+            </w:r>
+          </w:p>
+          <w:p>
+            <w:pPr>
+              <w:pStyle w:val="BodyText"/>
+              <w:spacing w:before="160" w:after="40"/>
+              <w:rPr>
+                <w:rFonts w:ascii="Arial" w:hAnsi="Arial" w:eastAsia="Arial" w:cs="Arial"/>
+                <w:i/>
+                <w:iCs/>
+                <w:color w:val="1C2833"/>
+              </w:rPr>
+            </w:pPr>
+            <w:r>
+              <w:rPr>
+                <w:rFonts w:eastAsia="Arial" w:cs="Arial" w:ascii="Arial" w:hAnsi="Arial"/>
+                <w:i/>
+                <w:iCs/>
+                <w:color w:val="1C2833"/>
+              </w:rPr>
+              <w:t>Immersion au sein de la Direction Régionale de l’Agriculture, de l’Hydraulique Villageoise et du Développement Rural, avec découverte de l’environnement informatique professionnel et mise en pratique des connaissances acquises en développement, bases de données et réseaux.</w:t>
+            </w:r>
+          </w:p>
+          <w:p>
+            <w:pPr>
+              <w:pStyle w:val="Normal"/>
+              <w:spacing w:before="160" w:after="40"/>
+              <w:rPr>
+                <w:rFonts w:ascii="Arial" w:hAnsi="Arial" w:eastAsia="Arial" w:cs="Arial"/>
+                <w:b w:val="false"/>
+                <w:bCs w:val="false"/>
+                <w:i/>
+                <w:iCs/>
+                <w:color w:val="1C2833"/>
+                <w:sz w:val="20"/>
+                <w:szCs w:val="20"/>
+              </w:rPr>
+            </w:pPr>
+            <w:r>
+              <w:rPr>
+                <w:rFonts w:eastAsia="Arial" w:cs="Arial" w:ascii="Arial" w:hAnsi="Arial"/>
+                <w:b w:val="false"/>
+                <w:bCs w:val="false"/>
+                <w:i/>
+                <w:iCs/>
+                <w:color w:val="1C2833"/>
+                <w:sz w:val="20"/>
+                <w:szCs w:val="20"/>
+              </w:rPr>
             </w:r>
           </w:p>
           <w:p>
@@ -1311,55 +1338,16 @@
             <w:pPr>
               <w:pStyle w:val="BodyText"/>
               <w:spacing w:before="160" w:after="40"/>
-              <w:rPr>
-                <w:rFonts w:ascii="Arial" w:hAnsi="Arial" w:eastAsia="Arial" w:cs="Arial"/>
+              <w:rPr/>
+            </w:pPr>
+            <w:r>
+              <w:rPr>
+                <w:rFonts w:eastAsia="Arial" w:cs="Arial" w:ascii="Arial" w:hAnsi="Arial"/>
                 <w:b/>
                 <w:bCs/>
                 <w:color w:val="1C2833"/>
               </w:rPr>
-            </w:pPr>
-            <w:r>
-              <w:rPr>
-                <w:rFonts w:eastAsia="Arial" w:cs="Arial" w:ascii="Arial" w:hAnsi="Arial"/>
-                <w:b/>
-                <w:bCs/>
-                <w:color w:val="1C2833"/>
-              </w:rPr>
               <w:t>Formation orientée vers le développement d’applications, la conception de systèmes informatiques, les bases de données et les technologies du numérique.</w:t>
-            </w:r>
-          </w:p>
-          <w:p>
-            <w:pPr>
-              <w:pStyle w:val="Normal"/>
-              <w:spacing w:before="160" w:after="40"/>
-              <w:rPr>
-                <w:rFonts w:ascii="Arial" w:hAnsi="Arial" w:eastAsia="Arial" w:cs="Arial"/>
-                <w:b/>
-                <w:bCs/>
-                <w:color w:val="1C2833"/>
-                <w:sz w:val="21"/>
-                <w:szCs w:val="21"/>
-              </w:rPr>
-            </w:pPr>
-            <w:r>
-              <w:rPr>
-                <w:rFonts w:eastAsia="Arial" w:cs="Arial" w:ascii="Arial" w:hAnsi="Arial"/>
-                <w:b/>
-                <w:bCs/>
-                <w:color w:val="1C2833"/>
-                <w:sz w:val="20"/>
-                <w:szCs w:val="20"/>
-              </w:rPr>
-            </w:r>
-          </w:p>
-          <w:p>
-            <w:pPr>
-              <w:pStyle w:val="Normal"/>
-              <w:spacing w:before="0" w:after="60"/>
-              <w:rPr/>
-            </w:pPr>
-            <w:r>
-              <w:rPr/>
             </w:r>
           </w:p>
           <w:p>

</xml_diff>